<commit_message>
v38 - fix ESLint errors for Vercel build
</commit_message>
<xml_diff>
--- a/Word Docs/Before Alliance Call.docx
+++ b/Word Docs/Before Alliance Call.docx
@@ -87,13 +87,28 @@
         </w:numPr>
       </w:pPr>
       <w:r>
-        <w:t>How many users (tell them 2</w:t>
+        <w:t xml:space="preserve">How many users (tell them </w:t>
+      </w:r>
+      <w:r>
+        <w:t xml:space="preserve">from </w:t>
+      </w:r>
+      <w:r>
+        <w:t>2</w:t>
       </w:r>
       <w:r>
         <w:t>26</w:t>
       </w:r>
       <w:r>
-        <w:t xml:space="preserve"> and growing fast)</w:t>
+        <w:t>-745</w:t>
+      </w:r>
+      <w:r>
+        <w:t xml:space="preserve"> </w:t>
+      </w:r>
+      <w:r>
+        <w:t xml:space="preserve">less than a week </w:t>
+      </w:r>
+      <w:r>
+        <w:t>and growing fast)</w:t>
       </w:r>
     </w:p>
     <w:p>

</xml_diff>